<commit_message>
correcciones generales a las paginas razor y añadida prueba de dos dispositivos reseñados
</commit_message>
<xml_diff>
--- a/test/AppForSEII2526.UIT/ReviewDevices/CasosdePruebas_review.docx
+++ b/test/AppForSEII2526.UIT/ReviewDevices/CasosdePruebas_review.docx
@@ -4,7 +4,7 @@
   <w:body>
     <w:p>
       <w:pPr>
-        <w:pStyle w:val="Ttulo"/>
+        <w:pStyle w:val="Title"/>
         <w:rPr>
           <w:lang w:val="es-ES"/>
         </w:rPr>
@@ -12,7 +12,7 @@
     </w:p>
     <w:p>
       <w:pPr>
-        <w:pStyle w:val="Ttulo"/>
+        <w:pStyle w:val="Title"/>
         <w:jc w:val="right"/>
         <w:rPr>
           <w:lang w:val="es-ES"/>
@@ -39,7 +39,7 @@
     </w:p>
     <w:p>
       <w:pPr>
-        <w:pStyle w:val="Ttulo"/>
+        <w:pStyle w:val="Title"/>
         <w:jc w:val="right"/>
         <w:rPr>
           <w:lang w:val="es-ES"/>
@@ -54,7 +54,7 @@
     </w:p>
     <w:p>
       <w:pPr>
-        <w:pStyle w:val="Ttulo"/>
+        <w:pStyle w:val="Title"/>
         <w:jc w:val="right"/>
         <w:rPr>
           <w:lang w:val="es-ES"/>
@@ -63,7 +63,7 @@
     </w:p>
     <w:p>
       <w:pPr>
-        <w:pStyle w:val="Ttulo"/>
+        <w:pStyle w:val="Title"/>
         <w:jc w:val="right"/>
         <w:rPr>
           <w:sz w:val="28"/>
@@ -87,7 +87,7 @@
     </w:p>
     <w:p>
       <w:pPr>
-        <w:pStyle w:val="Ttulo"/>
+        <w:pStyle w:val="Title"/>
         <w:rPr>
           <w:sz w:val="28"/>
           <w:lang w:val="es-ES"/>
@@ -110,7 +110,7 @@
     </w:p>
     <w:p>
       <w:pPr>
-        <w:pStyle w:val="Textoindependiente"/>
+        <w:pStyle w:val="BodyText"/>
         <w:rPr>
           <w:lang w:val="es-ES"/>
         </w:rPr>
@@ -138,7 +138,7 @@
     </w:p>
     <w:p>
       <w:pPr>
-        <w:pStyle w:val="Ttulo"/>
+        <w:pStyle w:val="Title"/>
         <w:rPr>
           <w:lang w:val="es-ES"/>
         </w:rPr>
@@ -369,7 +369,21 @@
               <w:rPr>
                 <w:lang w:val="es-ES"/>
               </w:rPr>
-              <w:t>&lt;details&gt;</w:t>
+              <w:t>&lt;</w:t>
+            </w:r>
+            <w:proofErr w:type="spellStart"/>
+            <w:r>
+              <w:rPr>
+                <w:lang w:val="es-ES"/>
+              </w:rPr>
+              <w:t>details</w:t>
+            </w:r>
+            <w:proofErr w:type="spellEnd"/>
+            <w:r>
+              <w:rPr>
+                <w:lang w:val="es-ES"/>
+              </w:rPr>
+              <w:t>&gt;</w:t>
             </w:r>
           </w:p>
         </w:tc>
@@ -565,7 +579,7 @@
     </w:p>
     <w:p>
       <w:pPr>
-        <w:pStyle w:val="Ttulo"/>
+        <w:pStyle w:val="Title"/>
         <w:jc w:val="both"/>
         <w:rPr>
           <w:lang w:val="es-ES"/>
@@ -580,7 +594,7 @@
     </w:p>
     <w:p>
       <w:pPr>
-        <w:pStyle w:val="Ttulo"/>
+        <w:pStyle w:val="Title"/>
         <w:rPr>
           <w:lang w:val="es-ES"/>
         </w:rPr>
@@ -596,7 +610,7 @@
     </w:p>
     <w:p>
       <w:pPr>
-        <w:pStyle w:val="Ttulo"/>
+        <w:pStyle w:val="Title"/>
         <w:rPr>
           <w:lang w:val="es-ES"/>
         </w:rPr>
@@ -637,8 +651,18 @@
           <w:bCs/>
           <w:lang w:val="es-ES"/>
         </w:rPr>
-        <w:t>Input/Output Specification</w:t>
-      </w:r>
+        <w:t xml:space="preserve">Input/Output </w:t>
+      </w:r>
+      <w:proofErr w:type="spellStart"/>
+      <w:r>
+        <w:rPr>
+          <w:b/>
+          <w:bCs/>
+          <w:lang w:val="es-ES"/>
+        </w:rPr>
+        <w:t>Specification</w:t>
+      </w:r>
+      <w:proofErr w:type="spellEnd"/>
     </w:p>
     <w:p>
       <w:pPr>
@@ -662,7 +686,7 @@
     </w:p>
     <w:tbl>
       <w:tblPr>
-        <w:tblStyle w:val="Tablaconcuadrcula"/>
+        <w:tblStyle w:val="TableGrid"/>
         <w:tblW w:w="0" w:type="auto"/>
         <w:tblLook w:val="04A0" w:firstRow="1" w:lastRow="0" w:firstColumn="1" w:lastColumn="0" w:noHBand="0" w:noVBand="1"/>
       </w:tblPr>
@@ -738,8 +762,30 @@
               <w:rPr>
                 <w:lang w:val="es-ES"/>
               </w:rPr>
-              <w:t xml:space="preserve"> – Review successful</w:t>
-            </w:r>
+              <w:t xml:space="preserve"> – </w:t>
+            </w:r>
+            <w:proofErr w:type="spellStart"/>
+            <w:r>
+              <w:rPr>
+                <w:lang w:val="es-ES"/>
+              </w:rPr>
+              <w:t>Review</w:t>
+            </w:r>
+            <w:proofErr w:type="spellEnd"/>
+            <w:r>
+              <w:rPr>
+                <w:lang w:val="es-ES"/>
+              </w:rPr>
+              <w:t xml:space="preserve"> </w:t>
+            </w:r>
+            <w:proofErr w:type="spellStart"/>
+            <w:r>
+              <w:rPr>
+                <w:lang w:val="es-ES"/>
+              </w:rPr>
+              <w:t>successful</w:t>
+            </w:r>
+            <w:proofErr w:type="spellEnd"/>
           </w:p>
         </w:tc>
         <w:tc>
@@ -786,8 +832,16 @@
               <w:rPr>
                 <w:lang w:val="es-ES"/>
               </w:rPr>
-              <w:t xml:space="preserve"> – Filter devices</w:t>
-            </w:r>
+              <w:t xml:space="preserve"> – Filter </w:t>
+            </w:r>
+            <w:proofErr w:type="spellStart"/>
+            <w:r>
+              <w:rPr>
+                <w:lang w:val="es-ES"/>
+              </w:rPr>
+              <w:t>devices</w:t>
+            </w:r>
+            <w:proofErr w:type="spellEnd"/>
           </w:p>
         </w:tc>
         <w:tc>
@@ -912,7 +966,21 @@
               <w:rPr>
                 <w:lang w:val="es-ES"/>
               </w:rPr>
-              <w:t xml:space="preserve"> – Error mandatory data</w:t>
+              <w:t xml:space="preserve"> – Error </w:t>
+            </w:r>
+            <w:proofErr w:type="spellStart"/>
+            <w:r>
+              <w:rPr>
+                <w:lang w:val="es-ES"/>
+              </w:rPr>
+              <w:t>mandatory</w:t>
+            </w:r>
+            <w:proofErr w:type="spellEnd"/>
+            <w:r>
+              <w:rPr>
+                <w:lang w:val="es-ES"/>
+              </w:rPr>
+              <w:t xml:space="preserve"> data</w:t>
             </w:r>
           </w:p>
         </w:tc>
@@ -960,7 +1028,35 @@
               <w:rPr>
                 <w:lang w:val="es-ES"/>
               </w:rPr>
-              <w:t xml:space="preserve"> – Modify selection (Cancel)</w:t>
+              <w:t xml:space="preserve"> – </w:t>
+            </w:r>
+            <w:proofErr w:type="spellStart"/>
+            <w:r>
+              <w:rPr>
+                <w:lang w:val="es-ES"/>
+              </w:rPr>
+              <w:t>Modify</w:t>
+            </w:r>
+            <w:proofErr w:type="spellEnd"/>
+            <w:r>
+              <w:rPr>
+                <w:lang w:val="es-ES"/>
+              </w:rPr>
+              <w:t xml:space="preserve"> </w:t>
+            </w:r>
+            <w:proofErr w:type="spellStart"/>
+            <w:r>
+              <w:rPr>
+                <w:lang w:val="es-ES"/>
+              </w:rPr>
+              <w:t>selection</w:t>
+            </w:r>
+            <w:proofErr w:type="spellEnd"/>
+            <w:r>
+              <w:rPr>
+                <w:lang w:val="es-ES"/>
+              </w:rPr>
+              <w:t xml:space="preserve"> (Cancel)</w:t>
             </w:r>
           </w:p>
         </w:tc>
@@ -1071,18 +1167,18 @@
     </w:p>
     <w:tbl>
       <w:tblPr>
-        <w:tblStyle w:val="Tablaconcuadrcula"/>
+        <w:tblStyle w:val="TableGrid"/>
         <w:tblW w:w="0" w:type="auto"/>
         <w:tblLook w:val="04A0" w:firstRow="1" w:lastRow="0" w:firstColumn="1" w:lastColumn="0" w:noHBand="0" w:noVBand="1"/>
       </w:tblPr>
       <w:tblGrid>
-        <w:gridCol w:w="548"/>
-        <w:gridCol w:w="1435"/>
-        <w:gridCol w:w="1169"/>
-        <w:gridCol w:w="1156"/>
-        <w:gridCol w:w="1099"/>
-        <w:gridCol w:w="1283"/>
-        <w:gridCol w:w="2660"/>
+        <w:gridCol w:w="550"/>
+        <w:gridCol w:w="1441"/>
+        <w:gridCol w:w="1174"/>
+        <w:gridCol w:w="1066"/>
+        <w:gridCol w:w="1104"/>
+        <w:gridCol w:w="1343"/>
+        <w:gridCol w:w="2672"/>
       </w:tblGrid>
       <w:tr>
         <w:tc>
@@ -1098,7 +1194,7 @@
             </w:pPr>
             <w:r>
               <w:rPr>
-                <w:rStyle w:val="Textoennegrita"/>
+                <w:rStyle w:val="Strong"/>
                 <w:rFonts w:cs="Arial"/>
                 <w:color w:val="1F1F1F"/>
                 <w:bdr w:val="none" w:sz="0" w:space="0" w:color="auto" w:frame="1"/>
@@ -1118,14 +1214,25 @@
                 <w:lang w:val="es-ES"/>
               </w:rPr>
             </w:pPr>
-            <w:r>
-              <w:rPr>
-                <w:rStyle w:val="Textoennegrita"/>
+            <w:proofErr w:type="spellStart"/>
+            <w:r>
+              <w:rPr>
+                <w:rStyle w:val="Strong"/>
                 <w:rFonts w:cs="Arial"/>
                 <w:color w:val="1F1F1F"/>
                 <w:bdr w:val="none" w:sz="0" w:space="0" w:color="auto" w:frame="1"/>
               </w:rPr>
-              <w:t>Escenario/ condition</w:t>
+              <w:t>Escenario</w:t>
+            </w:r>
+            <w:proofErr w:type="spellEnd"/>
+            <w:r>
+              <w:rPr>
+                <w:rStyle w:val="Strong"/>
+                <w:rFonts w:cs="Arial"/>
+                <w:color w:val="1F1F1F"/>
+                <w:bdr w:val="none" w:sz="0" w:space="0" w:color="auto" w:frame="1"/>
+              </w:rPr>
+              <w:t>/ condition</w:t>
             </w:r>
           </w:p>
         </w:tc>
@@ -1142,7 +1249,7 @@
             </w:pPr>
             <w:r>
               <w:rPr>
-                <w:rStyle w:val="Textoennegrita"/>
+                <w:rStyle w:val="Strong"/>
                 <w:rFonts w:cs="Arial"/>
                 <w:color w:val="1F1F1F"/>
                 <w:bdr w:val="none" w:sz="0" w:space="0" w:color="auto" w:frame="1"/>
@@ -1164,7 +1271,7 @@
             </w:pPr>
             <w:r>
               <w:rPr>
-                <w:rStyle w:val="Textoennegrita"/>
+                <w:rStyle w:val="Strong"/>
                 <w:rFonts w:cs="Arial"/>
                 <w:color w:val="1F1F1F"/>
                 <w:bdr w:val="none" w:sz="0" w:space="0" w:color="auto" w:frame="1"/>
@@ -1186,7 +1293,7 @@
             </w:pPr>
             <w:r>
               <w:rPr>
-                <w:rStyle w:val="Textoennegrita"/>
+                <w:rStyle w:val="Strong"/>
                 <w:rFonts w:cs="Arial"/>
                 <w:color w:val="1F1F1F"/>
                 <w:bdr w:val="none" w:sz="0" w:space="0" w:color="auto" w:frame="1"/>
@@ -1208,7 +1315,7 @@
             </w:pPr>
             <w:r>
               <w:rPr>
-                <w:rStyle w:val="Textoennegrita"/>
+                <w:rStyle w:val="Strong"/>
                 <w:rFonts w:cs="Arial"/>
                 <w:color w:val="1F1F1F"/>
                 <w:bdr w:val="none" w:sz="0" w:space="0" w:color="auto" w:frame="1"/>
@@ -1230,7 +1337,7 @@
             </w:pPr>
             <w:r>
               <w:rPr>
-                <w:rStyle w:val="Textoennegrita"/>
+                <w:rStyle w:val="Strong"/>
                 <w:rFonts w:cs="Arial"/>
                 <w:color w:val="1F1F1F"/>
                 <w:bdr w:val="none" w:sz="0" w:space="0" w:color="auto" w:frame="1"/>
@@ -1321,7 +1428,7 @@
                 <w:color w:val="1F1F1F"/>
                 <w:bdr w:val="none" w:sz="0" w:space="0" w:color="auto" w:frame="1"/>
               </w:rPr>
-              <w:t>“Excelente compra”</w:t>
+              <w:t>“Review Perfecta”</w:t>
             </w:r>
           </w:p>
         </w:tc>
@@ -1416,7 +1523,46 @@
                 <w:rFonts w:ascii="Arial" w:hAnsi="Arial" w:cs="Arial"/>
                 <w:color w:val="1F1F1F"/>
               </w:rPr>
-              <w:t xml:space="preserve"> “Muy rápido”</w:t>
+              <w:t xml:space="preserve"> </w:t>
+            </w:r>
+            <w:r>
+              <w:rPr>
+                <w:rFonts w:ascii="Arial" w:hAnsi="Arial" w:cs="Arial"/>
+                <w:color w:val="1F1F1F"/>
+              </w:rPr>
+              <w:t>“</w:t>
+            </w:r>
+            <w:proofErr w:type="spellStart"/>
+            <w:r>
+              <w:rPr>
+                <w:rFonts w:ascii="Arial" w:hAnsi="Arial" w:cs="Arial"/>
+                <w:color w:val="1F1F1F"/>
+              </w:rPr>
+              <w:t>Excelente</w:t>
+            </w:r>
+            <w:proofErr w:type="spellEnd"/>
+            <w:r>
+              <w:rPr>
+                <w:rFonts w:ascii="Arial" w:hAnsi="Arial" w:cs="Arial"/>
+                <w:color w:val="1F1F1F"/>
+              </w:rPr>
+              <w:t xml:space="preserve"> </w:t>
+            </w:r>
+            <w:proofErr w:type="spellStart"/>
+            <w:r>
+              <w:rPr>
+                <w:rFonts w:ascii="Arial" w:hAnsi="Arial" w:cs="Arial"/>
+                <w:color w:val="1F1F1F"/>
+              </w:rPr>
+              <w:t>dispositivo</w:t>
+            </w:r>
+            <w:proofErr w:type="spellEnd"/>
+            <w:r>
+              <w:rPr>
+                <w:rFonts w:ascii="Arial" w:hAnsi="Arial" w:cs="Arial"/>
+                <w:color w:val="1F1F1F"/>
+              </w:rPr>
+              <w:t>”</w:t>
             </w:r>
           </w:p>
         </w:tc>
@@ -1455,15 +1601,17 @@
               </w:rPr>
               <w:t xml:space="preserve"> Redirección a </w:t>
             </w:r>
-            <w:r>
-              <w:rPr>
-                <w:rStyle w:val="CdigoHTML"/>
+            <w:proofErr w:type="spellStart"/>
+            <w:r>
+              <w:rPr>
+                <w:rStyle w:val="HTMLCode"/>
                 <w:rFonts w:cs="Arial"/>
                 <w:color w:val="444746"/>
                 <w:bdr w:val="none" w:sz="0" w:space="0" w:color="auto" w:frame="1"/>
               </w:rPr>
               <w:t>ReviewDetails</w:t>
             </w:r>
+            <w:proofErr w:type="spellEnd"/>
             <w:r>
               <w:rPr>
                 <w:rFonts w:ascii="Arial" w:hAnsi="Arial" w:cs="Arial"/>
@@ -1504,15 +1652,27 @@
                 <w:bdr w:val="none" w:sz="0" w:space="0" w:color="auto" w:frame="1"/>
                 <w:lang w:val="es-ES"/>
               </w:rPr>
-              <w:t>Data:</w:t>
-            </w:r>
-            <w:r>
-              <w:rPr>
-                <w:rFonts w:ascii="Arial" w:hAnsi="Arial" w:cs="Arial"/>
-                <w:color w:val="1F1F1F"/>
-                <w:lang w:val="es-ES"/>
-              </w:rPr>
-              <w:t xml:space="preserve"> Reseña guardada con Título “Excelente compra” y 1 ítem (XPS 15) con rating 5.</w:t>
+              <w:t>Reseña guardada con Título “</w:t>
+            </w:r>
+            <w:proofErr w:type="spellStart"/>
+            <w:r>
+              <w:rPr>
+                <w:rFonts w:ascii="Arial" w:hAnsi="Arial" w:cs="Arial"/>
+                <w:color w:val="1F1F1F"/>
+                <w:bdr w:val="none" w:sz="0" w:space="0" w:color="auto" w:frame="1"/>
+                <w:lang w:val="es-ES"/>
+              </w:rPr>
+              <w:t>Review</w:t>
+            </w:r>
+            <w:proofErr w:type="spellEnd"/>
+            <w:r>
+              <w:rPr>
+                <w:rFonts w:ascii="Arial" w:hAnsi="Arial" w:cs="Arial"/>
+                <w:color w:val="1F1F1F"/>
+                <w:bdr w:val="none" w:sz="0" w:space="0" w:color="auto" w:frame="1"/>
+                <w:lang w:val="es-ES"/>
+              </w:rPr>
+              <w:t xml:space="preserve"> Perfecta”, modelo “Standard”, y el comentario mapeado estrictamente como "Reseña para XPS 15: Excelente dispositivo".</w:t>
             </w:r>
           </w:p>
         </w:tc>
@@ -1593,7 +1753,25 @@
                 <w:color w:val="1F1F1F"/>
                 <w:bdr w:val="none" w:sz="0" w:space="0" w:color="auto" w:frame="1"/>
               </w:rPr>
-              <w:t>“Pack Oficina”</w:t>
+              <w:t xml:space="preserve">“Pack </w:t>
+            </w:r>
+            <w:proofErr w:type="spellStart"/>
+            <w:r>
+              <w:rPr>
+                <w:rFonts w:ascii="Arial" w:hAnsi="Arial" w:cs="Arial"/>
+                <w:color w:val="1F1F1F"/>
+                <w:bdr w:val="none" w:sz="0" w:space="0" w:color="auto" w:frame="1"/>
+              </w:rPr>
+              <w:t>Oficina</w:t>
+            </w:r>
+            <w:proofErr w:type="spellEnd"/>
+            <w:r>
+              <w:rPr>
+                <w:rFonts w:ascii="Arial" w:hAnsi="Arial" w:cs="Arial"/>
+                <w:color w:val="1F1F1F"/>
+                <w:bdr w:val="none" w:sz="0" w:space="0" w:color="auto" w:frame="1"/>
+              </w:rPr>
+              <w:t>”</w:t>
             </w:r>
           </w:p>
         </w:tc>
@@ -1688,7 +1866,23 @@
                 <w:rFonts w:ascii="Arial" w:hAnsi="Arial" w:cs="Arial"/>
                 <w:color w:val="1F1F1F"/>
               </w:rPr>
-              <w:t xml:space="preserve"> (Vacío)</w:t>
+              <w:t xml:space="preserve"> (</w:t>
+            </w:r>
+            <w:proofErr w:type="spellStart"/>
+            <w:r>
+              <w:rPr>
+                <w:rFonts w:ascii="Arial" w:hAnsi="Arial" w:cs="Arial"/>
+                <w:color w:val="1F1F1F"/>
+              </w:rPr>
+              <w:t>Vacío</w:t>
+            </w:r>
+            <w:proofErr w:type="spellEnd"/>
+            <w:r>
+              <w:rPr>
+                <w:rFonts w:ascii="Arial" w:hAnsi="Arial" w:cs="Arial"/>
+                <w:color w:val="1F1F1F"/>
+              </w:rPr>
+              <w:t>)</w:t>
             </w:r>
           </w:p>
         </w:tc>
@@ -1727,15 +1921,17 @@
               </w:rPr>
               <w:t xml:space="preserve"> Redirección a </w:t>
             </w:r>
-            <w:r>
-              <w:rPr>
-                <w:rStyle w:val="CdigoHTML"/>
+            <w:proofErr w:type="spellStart"/>
+            <w:r>
+              <w:rPr>
+                <w:rStyle w:val="HTMLCode"/>
                 <w:rFonts w:cs="Arial"/>
                 <w:color w:val="444746"/>
                 <w:bdr w:val="none" w:sz="0" w:space="0" w:color="auto" w:frame="1"/>
               </w:rPr>
               <w:t>ReviewDetails</w:t>
             </w:r>
+            <w:proofErr w:type="spellEnd"/>
             <w:r>
               <w:rPr>
                 <w:rFonts w:ascii="Arial" w:hAnsi="Arial" w:cs="Arial"/>
@@ -1865,7 +2061,25 @@
                 <w:color w:val="1F1F1F"/>
                 <w:bdr w:val="none" w:sz="0" w:space="0" w:color="auto" w:frame="1"/>
               </w:rPr>
-              <w:t>(Filtro Marca: "Dell")</w:t>
+              <w:t>(</w:t>
+            </w:r>
+            <w:proofErr w:type="spellStart"/>
+            <w:r>
+              <w:rPr>
+                <w:rFonts w:ascii="Arial" w:hAnsi="Arial" w:cs="Arial"/>
+                <w:color w:val="1F1F1F"/>
+                <w:bdr w:val="none" w:sz="0" w:space="0" w:color="auto" w:frame="1"/>
+              </w:rPr>
+              <w:t>Filtro</w:t>
+            </w:r>
+            <w:proofErr w:type="spellEnd"/>
+            <w:r>
+              <w:rPr>
+                <w:rFonts w:ascii="Arial" w:hAnsi="Arial" w:cs="Arial"/>
+                <w:color w:val="1F1F1F"/>
+                <w:bdr w:val="none" w:sz="0" w:space="0" w:color="auto" w:frame="1"/>
+              </w:rPr>
+              <w:t xml:space="preserve"> Marca: "Dell")</w:t>
             </w:r>
           </w:p>
         </w:tc>
@@ -1996,7 +2210,41 @@
                 <w:color w:val="1F1F1F"/>
                 <w:bdr w:val="none" w:sz="0" w:space="0" w:color="auto" w:frame="1"/>
               </w:rPr>
-              <w:t>(Filtro Año: 2022)</w:t>
+              <w:t>(</w:t>
+            </w:r>
+            <w:proofErr w:type="spellStart"/>
+            <w:r>
+              <w:rPr>
+                <w:rFonts w:ascii="Arial" w:hAnsi="Arial" w:cs="Arial"/>
+                <w:color w:val="1F1F1F"/>
+                <w:bdr w:val="none" w:sz="0" w:space="0" w:color="auto" w:frame="1"/>
+              </w:rPr>
+              <w:t>Filtro</w:t>
+            </w:r>
+            <w:proofErr w:type="spellEnd"/>
+            <w:r>
+              <w:rPr>
+                <w:rFonts w:ascii="Arial" w:hAnsi="Arial" w:cs="Arial"/>
+                <w:color w:val="1F1F1F"/>
+                <w:bdr w:val="none" w:sz="0" w:space="0" w:color="auto" w:frame="1"/>
+              </w:rPr>
+              <w:t xml:space="preserve"> Año: 202</w:t>
+            </w:r>
+            <w:r>
+              <w:rPr>
+                <w:rFonts w:ascii="Arial" w:hAnsi="Arial" w:cs="Arial"/>
+                <w:color w:val="1F1F1F"/>
+                <w:bdr w:val="none" w:sz="0" w:space="0" w:color="auto" w:frame="1"/>
+              </w:rPr>
+              <w:t>4</w:t>
+            </w:r>
+            <w:r>
+              <w:rPr>
+                <w:rFonts w:ascii="Arial" w:hAnsi="Arial" w:cs="Arial"/>
+                <w:color w:val="1F1F1F"/>
+                <w:bdr w:val="none" w:sz="0" w:space="0" w:color="auto" w:frame="1"/>
+              </w:rPr>
+              <w:t>)</w:t>
             </w:r>
           </w:p>
         </w:tc>
@@ -2094,7 +2342,25 @@
                 <w:color w:val="1F1F1F"/>
                 <w:bdr w:val="none" w:sz="0" w:space="0" w:color="auto" w:frame="1"/>
               </w:rPr>
-              <w:t>Filtered devices: “Pixel 7”, “Google”, “Obsidian”, 2022.</w:t>
+              <w:t>Filtered devices: “MX Keys S”, “Logitech”, “</w:t>
+            </w:r>
+            <w:proofErr w:type="spellStart"/>
+            <w:r>
+              <w:rPr>
+                <w:rFonts w:ascii="Arial" w:hAnsi="Arial" w:cs="Arial"/>
+                <w:color w:val="1F1F1F"/>
+                <w:bdr w:val="none" w:sz="0" w:space="0" w:color="auto" w:frame="1"/>
+              </w:rPr>
+              <w:t>Grafito</w:t>
+            </w:r>
+            <w:proofErr w:type="spellEnd"/>
+            <w:r>
+              <w:rPr>
+                <w:rFonts w:ascii="Arial" w:hAnsi="Arial" w:cs="Arial"/>
+                <w:color w:val="1F1F1F"/>
+                <w:bdr w:val="none" w:sz="0" w:space="0" w:color="auto" w:frame="1"/>
+              </w:rPr>
+              <w:t>”, 2024.</w:t>
             </w:r>
           </w:p>
         </w:tc>
@@ -2117,7 +2383,6 @@
                 <w:color w:val="1F1F1F"/>
                 <w:bdr w:val="none" w:sz="0" w:space="0" w:color="auto" w:frame="1"/>
               </w:rPr>
-              <w:lastRenderedPageBreak/>
               <w:t>TC-05</w:t>
             </w:r>
           </w:p>
@@ -2155,7 +2420,7 @@
                 <w:color w:val="1F1F1F"/>
                 <w:bdr w:val="none" w:sz="0" w:space="0" w:color="auto" w:frame="1"/>
               </w:rPr>
-              <w:t>Selected: “XPS 15”, “MX Keys S”</w:t>
+              <w:t xml:space="preserve">Selected: “XPS 15”, </w:t>
             </w:r>
           </w:p>
         </w:tc>
@@ -2235,11 +2500,17 @@
             </w:r>
           </w:p>
           <w:p>
-            <w:r>
-              <w:rPr>
-                <w:rFonts w:ascii="Arial" w:hAnsi="Arial" w:cs="Arial"/>
-                <w:color w:val="1F1F1F"/>
-                <w:bdr w:val="none" w:sz="0" w:space="0" w:color="auto" w:frame="1"/>
+            <w:pPr>
+              <w:rPr>
+                <w:lang w:val="es-ES"/>
+              </w:rPr>
+            </w:pPr>
+            <w:r>
+              <w:rPr>
+                <w:rFonts w:ascii="Arial" w:hAnsi="Arial" w:cs="Arial"/>
+                <w:color w:val="1F1F1F"/>
+                <w:bdr w:val="none" w:sz="0" w:space="0" w:color="auto" w:frame="1"/>
+                <w:lang w:val="es-ES"/>
               </w:rPr>
               <w:t>Shown:</w:t>
             </w:r>
@@ -2247,8 +2518,53 @@
               <w:rPr>
                 <w:rFonts w:ascii="Arial" w:hAnsi="Arial" w:cs="Arial"/>
                 <w:color w:val="1F1F1F"/>
-              </w:rPr>
-              <w:t xml:space="preserve"> Cart shows only “MX Keys S”.</w:t>
+                <w:lang w:val="es-ES"/>
+              </w:rPr>
+              <w:t xml:space="preserve"> </w:t>
+            </w:r>
+            <w:r>
+              <w:rPr>
+                <w:rFonts w:ascii="Arial" w:hAnsi="Arial" w:cs="Arial"/>
+                <w:color w:val="1F1F1F"/>
+                <w:lang w:val="es-ES"/>
+              </w:rPr>
+              <w:t>El carrito queda vacío y el botón "</w:t>
+            </w:r>
+            <w:proofErr w:type="spellStart"/>
+            <w:r>
+              <w:rPr>
+                <w:rFonts w:ascii="Arial" w:hAnsi="Arial" w:cs="Arial"/>
+                <w:color w:val="1F1F1F"/>
+                <w:lang w:val="es-ES"/>
+              </w:rPr>
+              <w:t>Review</w:t>
+            </w:r>
+            <w:proofErr w:type="spellEnd"/>
+            <w:r>
+              <w:rPr>
+                <w:rFonts w:ascii="Arial" w:hAnsi="Arial" w:cs="Arial"/>
+                <w:color w:val="1F1F1F"/>
+                <w:lang w:val="es-ES"/>
+              </w:rPr>
+              <w:t xml:space="preserve"> </w:t>
+            </w:r>
+            <w:proofErr w:type="spellStart"/>
+            <w:r>
+              <w:rPr>
+                <w:rFonts w:ascii="Arial" w:hAnsi="Arial" w:cs="Arial"/>
+                <w:color w:val="1F1F1F"/>
+                <w:lang w:val="es-ES"/>
+              </w:rPr>
+              <w:t>Devices</w:t>
+            </w:r>
+            <w:proofErr w:type="spellEnd"/>
+            <w:r>
+              <w:rPr>
+                <w:rFonts w:ascii="Arial" w:hAnsi="Arial" w:cs="Arial"/>
+                <w:color w:val="1F1F1F"/>
+                <w:lang w:val="es-ES"/>
+              </w:rPr>
+              <w:t>" se deshabilita automáticamente.</w:t>
             </w:r>
           </w:p>
         </w:tc>
@@ -2552,7 +2868,31 @@
                 <w:bdr w:val="none" w:sz="0" w:space="0" w:color="auto" w:frame="1"/>
                 <w:lang w:val="en-US"/>
               </w:rPr>
-              <w:t>Error: "The ReviewTitle field is required."</w:t>
+              <w:t xml:space="preserve">Error: "The </w:t>
+            </w:r>
+            <w:proofErr w:type="spellStart"/>
+            <w:r>
+              <w:rPr>
+                <w:rFonts w:ascii="Arial" w:hAnsi="Arial" w:cs="Arial"/>
+                <w:color w:val="1F1F1F"/>
+                <w:sz w:val="20"/>
+                <w:szCs w:val="20"/>
+                <w:bdr w:val="none" w:sz="0" w:space="0" w:color="auto" w:frame="1"/>
+                <w:lang w:val="en-US"/>
+              </w:rPr>
+              <w:t>ReviewTitle</w:t>
+            </w:r>
+            <w:proofErr w:type="spellEnd"/>
+            <w:r>
+              <w:rPr>
+                <w:rFonts w:ascii="Arial" w:hAnsi="Arial" w:cs="Arial"/>
+                <w:color w:val="1F1F1F"/>
+                <w:sz w:val="20"/>
+                <w:szCs w:val="20"/>
+                <w:bdr w:val="none" w:sz="0" w:space="0" w:color="auto" w:frame="1"/>
+                <w:lang w:val="en-US"/>
+              </w:rPr>
+              <w:t xml:space="preserve"> field is required."</w:t>
             </w:r>
           </w:p>
         </w:tc>
@@ -2717,7 +3057,31 @@
                 <w:bdr w:val="none" w:sz="0" w:space="0" w:color="auto" w:frame="1"/>
                 <w:lang w:val="en-US"/>
               </w:rPr>
-              <w:t>Error: "The CustomerCountry field is required."</w:t>
+              <w:t xml:space="preserve">Error: "The </w:t>
+            </w:r>
+            <w:proofErr w:type="spellStart"/>
+            <w:r>
+              <w:rPr>
+                <w:rFonts w:ascii="Arial" w:hAnsi="Arial" w:cs="Arial"/>
+                <w:color w:val="1F1F1F"/>
+                <w:sz w:val="20"/>
+                <w:szCs w:val="20"/>
+                <w:bdr w:val="none" w:sz="0" w:space="0" w:color="auto" w:frame="1"/>
+                <w:lang w:val="en-US"/>
+              </w:rPr>
+              <w:t>CustomerCountry</w:t>
+            </w:r>
+            <w:proofErr w:type="spellEnd"/>
+            <w:r>
+              <w:rPr>
+                <w:rFonts w:ascii="Arial" w:hAnsi="Arial" w:cs="Arial"/>
+                <w:color w:val="1F1F1F"/>
+                <w:sz w:val="20"/>
+                <w:szCs w:val="20"/>
+                <w:bdr w:val="none" w:sz="0" w:space="0" w:color="auto" w:frame="1"/>
+                <w:lang w:val="en-US"/>
+              </w:rPr>
+              <w:t xml:space="preserve"> field is required."</w:t>
             </w:r>
           </w:p>
         </w:tc>
@@ -2882,15 +3246,17 @@
               </w:rPr>
               <w:t xml:space="preserve"> Redirección a </w:t>
             </w:r>
-            <w:r>
-              <w:rPr>
-                <w:rStyle w:val="CdigoHTML"/>
+            <w:proofErr w:type="spellStart"/>
+            <w:r>
+              <w:rPr>
+                <w:rStyle w:val="HTMLCode"/>
                 <w:rFonts w:cs="Arial"/>
                 <w:color w:val="444746"/>
                 <w:bdr w:val="none" w:sz="0" w:space="0" w:color="auto" w:frame="1"/>
               </w:rPr>
               <w:t>ListDevicesForReview</w:t>
             </w:r>
+            <w:proofErr w:type="spellEnd"/>
             <w:r>
               <w:rPr>
                 <w:rFonts w:ascii="Arial" w:hAnsi="Arial" w:cs="Arial"/>
@@ -2947,7 +3313,56 @@
                 <w:sz w:val="20"/>
                 <w:szCs w:val="20"/>
               </w:rPr>
-              <w:t xml:space="preserve"> No se guarda nada en la BD.</w:t>
+              <w:t xml:space="preserve"> </w:t>
+            </w:r>
+            <w:r>
+              <w:rPr>
+                <w:rFonts w:ascii="Arial" w:hAnsi="Arial" w:cs="Arial"/>
+                <w:color w:val="1F1F1F"/>
+                <w:sz w:val="20"/>
+                <w:szCs w:val="20"/>
+              </w:rPr>
+              <w:t>No se guarda nada en la BD, pero se CONSERVAN los datos en memoria (el botón "</w:t>
+            </w:r>
+            <w:proofErr w:type="spellStart"/>
+            <w:r>
+              <w:rPr>
+                <w:rFonts w:ascii="Arial" w:hAnsi="Arial" w:cs="Arial"/>
+                <w:color w:val="1F1F1F"/>
+                <w:sz w:val="20"/>
+                <w:szCs w:val="20"/>
+              </w:rPr>
+              <w:t>Review</w:t>
+            </w:r>
+            <w:proofErr w:type="spellEnd"/>
+            <w:r>
+              <w:rPr>
+                <w:rFonts w:ascii="Arial" w:hAnsi="Arial" w:cs="Arial"/>
+                <w:color w:val="1F1F1F"/>
+                <w:sz w:val="20"/>
+                <w:szCs w:val="20"/>
+              </w:rPr>
+              <w:t xml:space="preserve"> </w:t>
+            </w:r>
+            <w:proofErr w:type="spellStart"/>
+            <w:r>
+              <w:rPr>
+                <w:rFonts w:ascii="Arial" w:hAnsi="Arial" w:cs="Arial"/>
+                <w:color w:val="1F1F1F"/>
+                <w:sz w:val="20"/>
+                <w:szCs w:val="20"/>
+              </w:rPr>
+              <w:t>Devices</w:t>
+            </w:r>
+            <w:proofErr w:type="spellEnd"/>
+            <w:r>
+              <w:rPr>
+                <w:rFonts w:ascii="Arial" w:hAnsi="Arial" w:cs="Arial"/>
+                <w:color w:val="1F1F1F"/>
+                <w:sz w:val="20"/>
+                <w:szCs w:val="20"/>
+              </w:rPr>
+              <w:t>" sigue habilitado y el dispositivo sigue en el carrito).</w:t>
             </w:r>
           </w:p>
         </w:tc>
@@ -3304,6 +3719,7 @@
           <w:szCs w:val="24"/>
           <w:lang w:val="es-ES" w:eastAsia="es-ES"/>
         </w:rPr>
+        <w:lastRenderedPageBreak/>
         <w:t>Entorno de Desarrollo (IDE):</w:t>
       </w:r>
       <w:r>
@@ -3349,7 +3765,67 @@
           <w:szCs w:val="24"/>
           <w:lang w:val="es-ES" w:eastAsia="es-ES"/>
         </w:rPr>
-        <w:t xml:space="preserve"> xUnit y Selenium WebDriver.</w:t>
+        <w:t xml:space="preserve"> </w:t>
+      </w:r>
+      <w:proofErr w:type="spellStart"/>
+      <w:r>
+        <w:rPr>
+          <w:rFonts w:ascii="Times New Roman" w:hAnsi="Times New Roman"/>
+          <w:sz w:val="24"/>
+          <w:szCs w:val="24"/>
+          <w:lang w:val="es-ES" w:eastAsia="es-ES"/>
+        </w:rPr>
+        <w:t>xUnit</w:t>
+      </w:r>
+      <w:proofErr w:type="spellEnd"/>
+      <w:r>
+        <w:rPr>
+          <w:rFonts w:ascii="Times New Roman" w:hAnsi="Times New Roman"/>
+          <w:sz w:val="24"/>
+          <w:szCs w:val="24"/>
+          <w:lang w:val="es-ES" w:eastAsia="es-ES"/>
+        </w:rPr>
+        <w:t xml:space="preserve"> y </w:t>
+      </w:r>
+      <w:proofErr w:type="spellStart"/>
+      <w:r>
+        <w:rPr>
+          <w:rFonts w:ascii="Times New Roman" w:hAnsi="Times New Roman"/>
+          <w:sz w:val="24"/>
+          <w:szCs w:val="24"/>
+          <w:lang w:val="es-ES" w:eastAsia="es-ES"/>
+        </w:rPr>
+        <w:t>Selenium</w:t>
+      </w:r>
+      <w:proofErr w:type="spellEnd"/>
+      <w:r>
+        <w:rPr>
+          <w:rFonts w:ascii="Times New Roman" w:hAnsi="Times New Roman"/>
+          <w:sz w:val="24"/>
+          <w:szCs w:val="24"/>
+          <w:lang w:val="es-ES" w:eastAsia="es-ES"/>
+        </w:rPr>
+        <w:t xml:space="preserve"> </w:t>
+      </w:r>
+      <w:proofErr w:type="spellStart"/>
+      <w:r>
+        <w:rPr>
+          <w:rFonts w:ascii="Times New Roman" w:hAnsi="Times New Roman"/>
+          <w:sz w:val="24"/>
+          <w:szCs w:val="24"/>
+          <w:lang w:val="es-ES" w:eastAsia="es-ES"/>
+        </w:rPr>
+        <w:t>WebDriver</w:t>
+      </w:r>
+      <w:proofErr w:type="spellEnd"/>
+      <w:r>
+        <w:rPr>
+          <w:rFonts w:ascii="Times New Roman" w:hAnsi="Times New Roman"/>
+          <w:sz w:val="24"/>
+          <w:szCs w:val="24"/>
+          <w:lang w:val="es-ES" w:eastAsia="es-ES"/>
+        </w:rPr>
+        <w:t>.</w:t>
       </w:r>
     </w:p>
     <w:p>
@@ -3385,7 +3861,27 @@
           <w:szCs w:val="24"/>
           <w:lang w:val="es-ES" w:eastAsia="es-ES"/>
         </w:rPr>
-        <w:t xml:space="preserve"> SQL Server (LocalDB o Express).</w:t>
+        <w:t xml:space="preserve"> SQL Server (</w:t>
+      </w:r>
+      <w:proofErr w:type="spellStart"/>
+      <w:r>
+        <w:rPr>
+          <w:rFonts w:ascii="Times New Roman" w:hAnsi="Times New Roman"/>
+          <w:sz w:val="24"/>
+          <w:szCs w:val="24"/>
+          <w:lang w:val="es-ES" w:eastAsia="es-ES"/>
+        </w:rPr>
+        <w:t>LocalDB</w:t>
+      </w:r>
+      <w:proofErr w:type="spellEnd"/>
+      <w:r>
+        <w:rPr>
+          <w:rFonts w:ascii="Times New Roman" w:hAnsi="Times New Roman"/>
+          <w:sz w:val="24"/>
+          <w:szCs w:val="24"/>
+          <w:lang w:val="es-ES" w:eastAsia="es-ES"/>
+        </w:rPr>
+        <w:t xml:space="preserve"> o Express).</w:t>
       </w:r>
     </w:p>
     <w:p>
@@ -3421,7 +3917,27 @@
           <w:szCs w:val="24"/>
           <w:lang w:val="es-ES" w:eastAsia="es-ES"/>
         </w:rPr>
-        <w:t xml:space="preserve"> Google Chrome o Microsoft Edge (asegurar que la versión del WebDriver coincida con la versión del navegador).</w:t>
+        <w:t xml:space="preserve"> Google Chrome o Microsoft Edge (asegurar que la versión del </w:t>
+      </w:r>
+      <w:proofErr w:type="spellStart"/>
+      <w:r>
+        <w:rPr>
+          <w:rFonts w:ascii="Times New Roman" w:hAnsi="Times New Roman"/>
+          <w:sz w:val="24"/>
+          <w:szCs w:val="24"/>
+          <w:lang w:val="es-ES" w:eastAsia="es-ES"/>
+        </w:rPr>
+        <w:t>WebDriver</w:t>
+      </w:r>
+      <w:proofErr w:type="spellEnd"/>
+      <w:r>
+        <w:rPr>
+          <w:rFonts w:ascii="Times New Roman" w:hAnsi="Times New Roman"/>
+          <w:sz w:val="24"/>
+          <w:szCs w:val="24"/>
+          <w:lang w:val="es-ES" w:eastAsia="es-ES"/>
+        </w:rPr>
+        <w:t xml:space="preserve"> coincida con la versión del navegador).</w:t>
       </w:r>
     </w:p>
     <w:p>
@@ -3511,7 +4027,6 @@
           <w:szCs w:val="27"/>
           <w:lang w:val="es-ES" w:eastAsia="es-ES"/>
         </w:rPr>
-        <w:lastRenderedPageBreak/>
         <w:t>4. Requisitos procedimentales especiales</w:t>
       </w:r>
     </w:p>
@@ -3571,39 +4086,31 @@
           <w:szCs w:val="24"/>
           <w:lang w:val="es-ES" w:eastAsia="es-ES"/>
         </w:rPr>
-        <w:t>Limpieza (Clean Up):</w:t>
-      </w:r>
-      <w:r>
-        <w:rPr>
-          <w:rFonts w:ascii="Times New Roman" w:hAnsi="Times New Roman"/>
+        <w:t>Limpieza (</w:t>
+      </w:r>
+      <w:proofErr w:type="spellStart"/>
+      <w:r>
+        <w:rPr>
+          <w:rFonts w:ascii="Times New Roman" w:hAnsi="Times New Roman"/>
+          <w:b/>
+          <w:bCs/>
           <w:sz w:val="24"/>
           <w:szCs w:val="24"/>
           <w:lang w:val="es-ES" w:eastAsia="es-ES"/>
         </w:rPr>
-        <w:t xml:space="preserve"> Elimina datos existentes de las tablas </w:t>
-      </w:r>
-      <w:r>
-        <w:rPr>
-          <w:rFonts w:ascii="Courier New" w:hAnsi="Courier New" w:cs="Courier New"/>
-          <w:lang w:val="es-ES" w:eastAsia="es-ES"/>
-        </w:rPr>
-        <w:t>ReviewItem</w:t>
-      </w:r>
-      <w:r>
-        <w:rPr>
-          <w:rFonts w:ascii="Times New Roman" w:hAnsi="Times New Roman"/>
+        <w:t>Clean</w:t>
+      </w:r>
+      <w:proofErr w:type="spellEnd"/>
+      <w:r>
+        <w:rPr>
+          <w:rFonts w:ascii="Times New Roman" w:hAnsi="Times New Roman"/>
+          <w:b/>
+          <w:bCs/>
           <w:sz w:val="24"/>
           <w:szCs w:val="24"/>
           <w:lang w:val="es-ES" w:eastAsia="es-ES"/>
         </w:rPr>
-        <w:t xml:space="preserve">, </w:t>
-      </w:r>
-      <w:r>
-        <w:rPr>
-          <w:rFonts w:ascii="Courier New" w:hAnsi="Courier New" w:cs="Courier New"/>
-          <w:lang w:val="es-ES" w:eastAsia="es-ES"/>
-        </w:rPr>
-        <w:t>Review</w:t>
+        <w:t xml:space="preserve"> Up):</w:t>
       </w:r>
       <w:r>
         <w:rPr>
@@ -3612,8 +4119,45 @@
           <w:szCs w:val="24"/>
           <w:lang w:val="es-ES" w:eastAsia="es-ES"/>
         </w:rPr>
+        <w:t xml:space="preserve"> Elimina datos existentes de las tablas </w:t>
+      </w:r>
+      <w:proofErr w:type="spellStart"/>
+      <w:r>
+        <w:rPr>
+          <w:rFonts w:ascii="Courier New" w:hAnsi="Courier New" w:cs="Courier New"/>
+          <w:lang w:val="es-ES" w:eastAsia="es-ES"/>
+        </w:rPr>
+        <w:t>ReviewItem</w:t>
+      </w:r>
+      <w:proofErr w:type="spellEnd"/>
+      <w:r>
+        <w:rPr>
+          <w:rFonts w:ascii="Times New Roman" w:hAnsi="Times New Roman"/>
+          <w:sz w:val="24"/>
+          <w:szCs w:val="24"/>
+          <w:lang w:val="es-ES" w:eastAsia="es-ES"/>
+        </w:rPr>
+        <w:t xml:space="preserve">, </w:t>
+      </w:r>
+      <w:proofErr w:type="spellStart"/>
+      <w:r>
+        <w:rPr>
+          <w:rFonts w:ascii="Courier New" w:hAnsi="Courier New" w:cs="Courier New"/>
+          <w:lang w:val="es-ES" w:eastAsia="es-ES"/>
+        </w:rPr>
+        <w:t>Review</w:t>
+      </w:r>
+      <w:proofErr w:type="spellEnd"/>
+      <w:r>
+        <w:rPr>
+          <w:rFonts w:ascii="Times New Roman" w:hAnsi="Times New Roman"/>
+          <w:sz w:val="24"/>
+          <w:szCs w:val="24"/>
+          <w:lang w:val="es-ES" w:eastAsia="es-ES"/>
+        </w:rPr>
         <w:t xml:space="preserve"> y </w:t>
       </w:r>
+      <w:proofErr w:type="spellStart"/>
       <w:r>
         <w:rPr>
           <w:rFonts w:ascii="Courier New" w:hAnsi="Courier New" w:cs="Courier New"/>
@@ -3621,6 +4165,7 @@
         </w:rPr>
         <w:t>Device</w:t>
       </w:r>
+      <w:proofErr w:type="spellEnd"/>
       <w:r>
         <w:rPr>
           <w:rFonts w:ascii="Times New Roman" w:hAnsi="Times New Roman"/>
@@ -3655,7 +4200,31 @@
           <w:szCs w:val="24"/>
           <w:lang w:val="es-ES" w:eastAsia="es-ES"/>
         </w:rPr>
-        <w:t>Carga de Dispositivos (Seeding):</w:t>
+        <w:t>Carga de Dispositivos (</w:t>
+      </w:r>
+      <w:proofErr w:type="spellStart"/>
+      <w:r>
+        <w:rPr>
+          <w:rFonts w:ascii="Times New Roman" w:hAnsi="Times New Roman"/>
+          <w:b/>
+          <w:bCs/>
+          <w:sz w:val="24"/>
+          <w:szCs w:val="24"/>
+          <w:lang w:val="es-ES" w:eastAsia="es-ES"/>
+        </w:rPr>
+        <w:t>Seeding</w:t>
+      </w:r>
+      <w:proofErr w:type="spellEnd"/>
+      <w:r>
+        <w:rPr>
+          <w:rFonts w:ascii="Times New Roman" w:hAnsi="Times New Roman"/>
+          <w:b/>
+          <w:bCs/>
+          <w:sz w:val="24"/>
+          <w:szCs w:val="24"/>
+          <w:lang w:val="es-ES" w:eastAsia="es-ES"/>
+        </w:rPr>
+        <w:t>):</w:t>
       </w:r>
       <w:r>
         <w:rPr>
@@ -3790,6 +4359,7 @@
         </w:rPr>
         <w:t xml:space="preserve"> con el rol </w:t>
       </w:r>
+      <w:proofErr w:type="spellStart"/>
       <w:r>
         <w:rPr>
           <w:rFonts w:ascii="Courier New" w:hAnsi="Courier New" w:cs="Courier New"/>
@@ -3797,6 +4367,7 @@
         </w:rPr>
         <w:t>Customer</w:t>
       </w:r>
+      <w:proofErr w:type="spellEnd"/>
       <w:r>
         <w:rPr>
           <w:rFonts w:ascii="Times New Roman" w:hAnsi="Times New Roman"/>
@@ -4086,8 +4657,9 @@
           <w:szCs w:val="24"/>
           <w:lang w:val="es-ES" w:eastAsia="es-ES"/>
         </w:rPr>
-        <w:t>Para la mayoría de las pruebas es necesario que antes se ejecute el archivo dbo.ResetDatabalse</w:t>
-      </w:r>
+        <w:t xml:space="preserve">Para la mayoría de las pruebas es necesario que antes se ejecute el archivo </w:t>
+      </w:r>
+      <w:proofErr w:type="spellStart"/>
       <w:r>
         <w:rPr>
           <w:rFonts w:ascii="Times New Roman" w:hAnsi="Times New Roman"/>
@@ -4095,7 +4667,7 @@
           <w:szCs w:val="24"/>
           <w:lang w:val="es-ES" w:eastAsia="es-ES"/>
         </w:rPr>
-        <w:t>.sql</w:t>
+        <w:t>dbo.ResetDatabase</w:t>
       </w:r>
       <w:r>
         <w:rPr>
@@ -4104,8 +4676,9 @@
           <w:szCs w:val="24"/>
           <w:lang w:val="es-ES" w:eastAsia="es-ES"/>
         </w:rPr>
-        <w:t>.</w:t>
-      </w:r>
+        <w:t>.sql</w:t>
+      </w:r>
+      <w:proofErr w:type="spellEnd"/>
       <w:r>
         <w:rPr>
           <w:rFonts w:ascii="Times New Roman" w:hAnsi="Times New Roman"/>
@@ -4113,7 +4686,7 @@
           <w:szCs w:val="24"/>
           <w:lang w:val="es-ES" w:eastAsia="es-ES"/>
         </w:rPr>
-        <w:t xml:space="preserve"> Esta ubicado en </w:t>
+        <w:t>.</w:t>
       </w:r>
       <w:r>
         <w:rPr>
@@ -4122,7 +4695,54 @@
           <w:szCs w:val="24"/>
           <w:lang w:val="es-ES" w:eastAsia="es-ES"/>
         </w:rPr>
-        <w:t>AppForSEII2526.UIT\ReviewDevices\</w:t>
+        <w:t xml:space="preserve"> </w:t>
+      </w:r>
+      <w:r>
+        <w:rPr>
+          <w:rFonts w:ascii="Times New Roman" w:hAnsi="Times New Roman"/>
+          <w:sz w:val="24"/>
+          <w:szCs w:val="24"/>
+          <w:lang w:val="es-ES" w:eastAsia="es-ES"/>
+        </w:rPr>
+        <w:t>Está</w:t>
+      </w:r>
+      <w:r>
+        <w:rPr>
+          <w:rFonts w:ascii="Times New Roman" w:hAnsi="Times New Roman"/>
+          <w:sz w:val="24"/>
+          <w:szCs w:val="24"/>
+          <w:lang w:val="es-ES" w:eastAsia="es-ES"/>
+        </w:rPr>
+        <w:t xml:space="preserve"> ubicado en </w:t>
+      </w:r>
+      <w:r>
+        <w:rPr>
+          <w:rFonts w:ascii="Times New Roman" w:hAnsi="Times New Roman"/>
+          <w:sz w:val="24"/>
+          <w:szCs w:val="24"/>
+          <w:lang w:val="es-ES" w:eastAsia="es-ES"/>
+        </w:rPr>
+        <w:t>AppForSEII2526.UIT\</w:t>
+      </w:r>
+      <w:proofErr w:type="spellStart"/>
+      <w:r>
+        <w:rPr>
+          <w:rFonts w:ascii="Times New Roman" w:hAnsi="Times New Roman"/>
+          <w:sz w:val="24"/>
+          <w:szCs w:val="24"/>
+          <w:lang w:val="es-ES" w:eastAsia="es-ES"/>
+        </w:rPr>
+        <w:t>ReviewDevices</w:t>
+      </w:r>
+      <w:proofErr w:type="spellEnd"/>
+      <w:r>
+        <w:rPr>
+          <w:rFonts w:ascii="Times New Roman" w:hAnsi="Times New Roman"/>
+          <w:sz w:val="24"/>
+          <w:szCs w:val="24"/>
+          <w:lang w:val="es-ES" w:eastAsia="es-ES"/>
+        </w:rPr>
+        <w:t>\</w:t>
       </w:r>
       <w:r>
         <w:rPr>
@@ -4158,17 +4778,10 @@
           <w:szCs w:val="24"/>
           <w:lang w:val="es-ES" w:eastAsia="es-ES"/>
         </w:rPr>
-        <w:t>TC-01 (Standard Review)</w:t>
-      </w:r>
-      <w:r>
-        <w:rPr>
-          <w:rFonts w:ascii="Times New Roman" w:hAnsi="Times New Roman"/>
-          <w:sz w:val="24"/>
-          <w:szCs w:val="24"/>
-          <w:lang w:val="es-ES" w:eastAsia="es-ES"/>
-        </w:rPr>
-        <w:t xml:space="preserve"> y </w:t>
-      </w:r>
+        <w:lastRenderedPageBreak/>
+        <w:t xml:space="preserve">TC-01 (Standard </w:t>
+      </w:r>
+      <w:proofErr w:type="spellStart"/>
       <w:r>
         <w:rPr>
           <w:rFonts w:ascii="Times New Roman" w:hAnsi="Times New Roman"/>
@@ -4178,7 +4791,87 @@
           <w:szCs w:val="24"/>
           <w:lang w:val="es-ES" w:eastAsia="es-ES"/>
         </w:rPr>
-        <w:t>TC-02 (Multiple Review)</w:t>
+        <w:t>Review</w:t>
+      </w:r>
+      <w:proofErr w:type="spellEnd"/>
+      <w:r>
+        <w:rPr>
+          <w:rFonts w:ascii="Times New Roman" w:hAnsi="Times New Roman"/>
+          <w:b/>
+          <w:bCs/>
+          <w:sz w:val="24"/>
+          <w:szCs w:val="24"/>
+          <w:lang w:val="es-ES" w:eastAsia="es-ES"/>
+        </w:rPr>
+        <w:t>)</w:t>
+      </w:r>
+      <w:r>
+        <w:rPr>
+          <w:rFonts w:ascii="Times New Roman" w:hAnsi="Times New Roman"/>
+          <w:sz w:val="24"/>
+          <w:szCs w:val="24"/>
+          <w:lang w:val="es-ES" w:eastAsia="es-ES"/>
+        </w:rPr>
+        <w:t xml:space="preserve"> y </w:t>
+      </w:r>
+      <w:r>
+        <w:rPr>
+          <w:rFonts w:ascii="Times New Roman" w:hAnsi="Times New Roman"/>
+          <w:b/>
+          <w:bCs/>
+          <w:sz w:val="24"/>
+          <w:szCs w:val="24"/>
+          <w:lang w:val="es-ES" w:eastAsia="es-ES"/>
+        </w:rPr>
+        <w:t>TC-02 (</w:t>
+      </w:r>
+      <w:proofErr w:type="spellStart"/>
+      <w:r>
+        <w:rPr>
+          <w:rFonts w:ascii="Times New Roman" w:hAnsi="Times New Roman"/>
+          <w:b/>
+          <w:bCs/>
+          <w:sz w:val="24"/>
+          <w:szCs w:val="24"/>
+          <w:lang w:val="es-ES" w:eastAsia="es-ES"/>
+        </w:rPr>
+        <w:t>Multiple</w:t>
+      </w:r>
+      <w:proofErr w:type="spellEnd"/>
+      <w:r>
+        <w:rPr>
+          <w:rFonts w:ascii="Times New Roman" w:hAnsi="Times New Roman"/>
+          <w:b/>
+          <w:bCs/>
+          <w:sz w:val="24"/>
+          <w:szCs w:val="24"/>
+          <w:lang w:val="es-ES" w:eastAsia="es-ES"/>
+        </w:rPr>
+        <w:t xml:space="preserve"> </w:t>
+      </w:r>
+      <w:proofErr w:type="spellStart"/>
+      <w:r>
+        <w:rPr>
+          <w:rFonts w:ascii="Times New Roman" w:hAnsi="Times New Roman"/>
+          <w:b/>
+          <w:bCs/>
+          <w:sz w:val="24"/>
+          <w:szCs w:val="24"/>
+          <w:lang w:val="es-ES" w:eastAsia="es-ES"/>
+        </w:rPr>
+        <w:t>Review</w:t>
+      </w:r>
+      <w:proofErr w:type="spellEnd"/>
+      <w:r>
+        <w:rPr>
+          <w:rFonts w:ascii="Times New Roman" w:hAnsi="Times New Roman"/>
+          <w:b/>
+          <w:bCs/>
+          <w:sz w:val="24"/>
+          <w:szCs w:val="24"/>
+          <w:lang w:val="es-ES" w:eastAsia="es-ES"/>
+        </w:rPr>
+        <w:t>)</w:t>
       </w:r>
       <w:r>
         <w:rPr>
@@ -4323,32 +5016,32 @@
           </w:pPr>
           <w:r>
             <w:rPr>
-              <w:rStyle w:val="Nmerodepgina"/>
+              <w:rStyle w:val="PageNumber"/>
             </w:rPr>
             <w:fldChar w:fldCharType="begin"/>
           </w:r>
           <w:r>
             <w:rPr>
-              <w:rStyle w:val="Nmerodepgina"/>
+              <w:rStyle w:val="PageNumber"/>
             </w:rPr>
             <w:instrText xml:space="preserve"> PAGE </w:instrText>
           </w:r>
           <w:r>
             <w:rPr>
-              <w:rStyle w:val="Nmerodepgina"/>
+              <w:rStyle w:val="PageNumber"/>
             </w:rPr>
             <w:fldChar w:fldCharType="separate"/>
           </w:r>
           <w:r>
             <w:rPr>
-              <w:rStyle w:val="Nmerodepgina"/>
+              <w:rStyle w:val="PageNumber"/>
               <w:noProof/>
             </w:rPr>
             <w:t>iii</w:t>
           </w:r>
           <w:r>
             <w:rPr>
-              <w:rStyle w:val="Nmerodepgina"/>
+              <w:rStyle w:val="PageNumber"/>
             </w:rPr>
             <w:fldChar w:fldCharType="end"/>
           </w:r>
@@ -4358,7 +5051,7 @@
   </w:tbl>
   <w:p>
     <w:pPr>
-      <w:pStyle w:val="Piedepgina"/>
+      <w:pStyle w:val="Footer"/>
     </w:pPr>
   </w:p>
 </w:ftr>
@@ -4457,32 +5150,32 @@
           </w:pPr>
           <w:r>
             <w:rPr>
-              <w:rStyle w:val="Nmerodepgina"/>
+              <w:rStyle w:val="PageNumber"/>
             </w:rPr>
             <w:fldChar w:fldCharType="begin"/>
           </w:r>
           <w:r>
             <w:rPr>
-              <w:rStyle w:val="Nmerodepgina"/>
+              <w:rStyle w:val="PageNumber"/>
             </w:rPr>
             <w:instrText xml:space="preserve"> PAGE </w:instrText>
           </w:r>
           <w:r>
             <w:rPr>
-              <w:rStyle w:val="Nmerodepgina"/>
+              <w:rStyle w:val="PageNumber"/>
             </w:rPr>
             <w:fldChar w:fldCharType="separate"/>
           </w:r>
           <w:r>
             <w:rPr>
-              <w:rStyle w:val="Nmerodepgina"/>
+              <w:rStyle w:val="PageNumber"/>
               <w:noProof/>
             </w:rPr>
             <w:t>2</w:t>
           </w:r>
           <w:r>
             <w:rPr>
-              <w:rStyle w:val="Nmerodepgina"/>
+              <w:rStyle w:val="PageNumber"/>
             </w:rPr>
             <w:fldChar w:fldCharType="end"/>
           </w:r>
@@ -4492,7 +5185,7 @@
   </w:tbl>
   <w:p>
     <w:pPr>
-      <w:pStyle w:val="Piedepgina"/>
+      <w:pStyle w:val="Footer"/>
     </w:pPr>
   </w:p>
 </w:ftr>
@@ -4565,7 +5258,7 @@
   </w:p>
   <w:p>
     <w:pPr>
-      <w:pStyle w:val="Encabezado"/>
+      <w:pStyle w:val="Header"/>
     </w:pPr>
   </w:p>
 </w:hdr>
@@ -4621,13 +5314,21 @@
             <w:ind w:right="68"/>
           </w:pPr>
           <w:r>
-            <w:t xml:space="preserve">  Versi</w:t>
+            <w:t xml:space="preserve">  </w:t>
+          </w:r>
+          <w:proofErr w:type="spellStart"/>
+          <w:r>
+            <w:t>Versi</w:t>
           </w:r>
           <w:r>
             <w:t>ó</w:t>
           </w:r>
           <w:r>
-            <w:t>n:           1.0</w:t>
+            <w:t>n</w:t>
+          </w:r>
+          <w:proofErr w:type="spellEnd"/>
+          <w:r>
+            <w:t>:           1.0</w:t>
           </w:r>
         </w:p>
       </w:tc>
@@ -4639,8 +5340,13 @@
         </w:tcPr>
         <w:p>
           <w:r>
-            <w:t>Casos de Prueba</w:t>
+            <w:t xml:space="preserve">Casos de </w:t>
           </w:r>
+          <w:proofErr w:type="spellStart"/>
+          <w:r>
+            <w:t>Prueba</w:t>
+          </w:r>
+          <w:proofErr w:type="spellEnd"/>
         </w:p>
       </w:tc>
       <w:tc>
@@ -4649,7 +5355,15 @@
         </w:tcPr>
         <w:p>
           <w:r>
-            <w:t xml:space="preserve">  Fecha:  </w:t>
+            <w:t xml:space="preserve">  </w:t>
+          </w:r>
+          <w:proofErr w:type="spellStart"/>
+          <w:r>
+            <w:t>Fecha</w:t>
+          </w:r>
+          <w:proofErr w:type="spellEnd"/>
+          <w:r>
+            <w:t xml:space="preserve">:  </w:t>
           </w:r>
           <w:r>
             <w:t>16</w:t>
@@ -4685,7 +5399,7 @@
   </w:tbl>
   <w:p>
     <w:pPr>
-      <w:pStyle w:val="Encabezado"/>
+      <w:pStyle w:val="Header"/>
     </w:pPr>
   </w:p>
 </w:hdr>
@@ -4700,7 +5414,7 @@
     <w:lvl w:ilvl="0">
       <w:start w:val="1"/>
       <w:numFmt w:val="decimal"/>
-      <w:pStyle w:val="Ttulo1"/>
+      <w:pStyle w:val="Heading1"/>
       <w:lvlText w:val="%1."/>
       <w:legacy w:legacy="1" w:legacySpace="144" w:legacyIndent="0"/>
       <w:lvlJc w:val="left"/>
@@ -4708,7 +5422,7 @@
     <w:lvl w:ilvl="1">
       <w:start w:val="1"/>
       <w:numFmt w:val="decimal"/>
-      <w:pStyle w:val="Ttulo2"/>
+      <w:pStyle w:val="Heading2"/>
       <w:lvlText w:val="%1.%2"/>
       <w:legacy w:legacy="1" w:legacySpace="144" w:legacyIndent="0"/>
       <w:lvlJc w:val="left"/>
@@ -4716,7 +5430,7 @@
     <w:lvl w:ilvl="2">
       <w:start w:val="1"/>
       <w:numFmt w:val="decimal"/>
-      <w:pStyle w:val="Ttulo3"/>
+      <w:pStyle w:val="Heading3"/>
       <w:lvlText w:val="%1.%2.%3"/>
       <w:legacy w:legacy="1" w:legacySpace="144" w:legacyIndent="0"/>
       <w:lvlJc w:val="left"/>
@@ -4724,7 +5438,7 @@
     <w:lvl w:ilvl="3">
       <w:start w:val="1"/>
       <w:numFmt w:val="decimal"/>
-      <w:pStyle w:val="Ttulo4"/>
+      <w:pStyle w:val="Heading4"/>
       <w:lvlText w:val="%1.%2.%3.%4"/>
       <w:legacy w:legacy="1" w:legacySpace="144" w:legacyIndent="0"/>
       <w:lvlJc w:val="left"/>
@@ -4732,7 +5446,7 @@
     <w:lvl w:ilvl="4">
       <w:start w:val="1"/>
       <w:numFmt w:val="decimal"/>
-      <w:pStyle w:val="Ttulo5"/>
+      <w:pStyle w:val="Heading5"/>
       <w:lvlText w:val="%1.%2.%3.%4.%5"/>
       <w:legacy w:legacy="1" w:legacySpace="144" w:legacyIndent="0"/>
       <w:lvlJc w:val="left"/>
@@ -4740,7 +5454,7 @@
     <w:lvl w:ilvl="5">
       <w:start w:val="1"/>
       <w:numFmt w:val="decimal"/>
-      <w:pStyle w:val="Ttulo6"/>
+      <w:pStyle w:val="Heading6"/>
       <w:lvlText w:val="%1.%2.%3.%4.%5.%6"/>
       <w:legacy w:legacy="1" w:legacySpace="144" w:legacyIndent="0"/>
       <w:lvlJc w:val="left"/>
@@ -4748,7 +5462,7 @@
     <w:lvl w:ilvl="6">
       <w:start w:val="1"/>
       <w:numFmt w:val="decimal"/>
-      <w:pStyle w:val="Ttulo7"/>
+      <w:pStyle w:val="Heading7"/>
       <w:lvlText w:val="%1.%2.%3.%4.%5.%6.%7"/>
       <w:legacy w:legacy="1" w:legacySpace="144" w:legacyIndent="0"/>
       <w:lvlJc w:val="left"/>
@@ -4756,7 +5470,7 @@
     <w:lvl w:ilvl="7">
       <w:start w:val="1"/>
       <w:numFmt w:val="decimal"/>
-      <w:pStyle w:val="Ttulo8"/>
+      <w:pStyle w:val="Heading8"/>
       <w:lvlText w:val="%1.%2.%3.%4.%5.%6.%7.%8"/>
       <w:legacy w:legacy="1" w:legacySpace="144" w:legacyIndent="0"/>
       <w:lvlJc w:val="left"/>
@@ -4764,7 +5478,7 @@
     <w:lvl w:ilvl="8">
       <w:start w:val="1"/>
       <w:numFmt w:val="decimal"/>
-      <w:pStyle w:val="Ttulo9"/>
+      <w:pStyle w:val="Heading9"/>
       <w:lvlText w:val="%1.%2.%3.%4.%5.%6.%7.%8.%9"/>
       <w:legacy w:legacy="1" w:legacySpace="144" w:legacyIndent="0"/>
       <w:lvlJc w:val="left"/>
@@ -8243,11 +8957,11 @@
       <w:lang w:val="en-US"/>
     </w:rPr>
   </w:style>
-  <w:style w:type="paragraph" w:styleId="Ttulo1">
+  <w:style w:type="paragraph" w:styleId="Heading1">
     <w:name w:val="heading 1"/>
     <w:basedOn w:val="Normal"/>
     <w:next w:val="Normal"/>
-    <w:link w:val="Ttulo1Car"/>
+    <w:link w:val="Heading1Char"/>
     <w:qFormat/>
     <w:rsid w:val="004F02E8"/>
     <w:pPr>
@@ -8264,11 +8978,11 @@
       <w:sz w:val="24"/>
     </w:rPr>
   </w:style>
-  <w:style w:type="paragraph" w:styleId="Ttulo2">
+  <w:style w:type="paragraph" w:styleId="Heading2">
     <w:name w:val="heading 2"/>
-    <w:basedOn w:val="Ttulo1"/>
+    <w:basedOn w:val="Heading1"/>
     <w:next w:val="Normal"/>
-    <w:link w:val="Ttulo2Car"/>
+    <w:link w:val="Heading2Char"/>
     <w:qFormat/>
     <w:rsid w:val="001D76E1"/>
     <w:pPr>
@@ -8281,11 +8995,11 @@
       <w:sz w:val="20"/>
     </w:rPr>
   </w:style>
-  <w:style w:type="paragraph" w:styleId="Ttulo3">
+  <w:style w:type="paragraph" w:styleId="Heading3">
     <w:name w:val="heading 3"/>
-    <w:basedOn w:val="Ttulo1"/>
+    <w:basedOn w:val="Heading1"/>
     <w:next w:val="Normal"/>
-    <w:link w:val="Ttulo3Car"/>
+    <w:link w:val="Heading3Char"/>
     <w:qFormat/>
     <w:rsid w:val="001D76E1"/>
     <w:pPr>
@@ -8300,11 +9014,11 @@
       <w:sz w:val="20"/>
     </w:rPr>
   </w:style>
-  <w:style w:type="paragraph" w:styleId="Ttulo4">
+  <w:style w:type="paragraph" w:styleId="Heading4">
     <w:name w:val="heading 4"/>
-    <w:basedOn w:val="Ttulo1"/>
+    <w:basedOn w:val="Heading1"/>
     <w:next w:val="Normal"/>
-    <w:link w:val="Ttulo4Car"/>
+    <w:link w:val="Heading4Char"/>
     <w:qFormat/>
     <w:rsid w:val="001D76E1"/>
     <w:pPr>
@@ -8318,11 +9032,11 @@
       <w:sz w:val="20"/>
     </w:rPr>
   </w:style>
-  <w:style w:type="paragraph" w:styleId="Ttulo5">
+  <w:style w:type="paragraph" w:styleId="Heading5">
     <w:name w:val="heading 5"/>
     <w:basedOn w:val="Normal"/>
     <w:next w:val="Normal"/>
-    <w:link w:val="Ttulo5Car"/>
+    <w:link w:val="Heading5Char"/>
     <w:qFormat/>
     <w:rsid w:val="001D76E1"/>
     <w:pPr>
@@ -8338,11 +9052,11 @@
       <w:sz w:val="22"/>
     </w:rPr>
   </w:style>
-  <w:style w:type="paragraph" w:styleId="Ttulo6">
+  <w:style w:type="paragraph" w:styleId="Heading6">
     <w:name w:val="heading 6"/>
     <w:basedOn w:val="Normal"/>
     <w:next w:val="Normal"/>
-    <w:link w:val="Ttulo6Car"/>
+    <w:link w:val="Heading6Char"/>
     <w:qFormat/>
     <w:rsid w:val="001D76E1"/>
     <w:pPr>
@@ -8359,11 +9073,11 @@
       <w:sz w:val="22"/>
     </w:rPr>
   </w:style>
-  <w:style w:type="paragraph" w:styleId="Ttulo7">
+  <w:style w:type="paragraph" w:styleId="Heading7">
     <w:name w:val="heading 7"/>
     <w:basedOn w:val="Normal"/>
     <w:next w:val="Normal"/>
-    <w:link w:val="Ttulo7Car"/>
+    <w:link w:val="Heading7Char"/>
     <w:qFormat/>
     <w:rsid w:val="001D76E1"/>
     <w:pPr>
@@ -8376,11 +9090,11 @@
       <w:outlineLvl w:val="6"/>
     </w:pPr>
   </w:style>
-  <w:style w:type="paragraph" w:styleId="Ttulo8">
+  <w:style w:type="paragraph" w:styleId="Heading8">
     <w:name w:val="heading 8"/>
     <w:basedOn w:val="Normal"/>
     <w:next w:val="Normal"/>
-    <w:link w:val="Ttulo8Car"/>
+    <w:link w:val="Heading8Char"/>
     <w:qFormat/>
     <w:rsid w:val="001D76E1"/>
     <w:pPr>
@@ -8396,11 +9110,11 @@
       <w:i/>
     </w:rPr>
   </w:style>
-  <w:style w:type="paragraph" w:styleId="Ttulo9">
+  <w:style w:type="paragraph" w:styleId="Heading9">
     <w:name w:val="heading 9"/>
     <w:basedOn w:val="Normal"/>
     <w:next w:val="Normal"/>
-    <w:link w:val="Ttulo9Car"/>
+    <w:link w:val="Heading9Char"/>
     <w:qFormat/>
     <w:rsid w:val="001D76E1"/>
     <w:pPr>
@@ -8418,13 +9132,12 @@
       <w:sz w:val="18"/>
     </w:rPr>
   </w:style>
-  <w:style w:type="character" w:default="1" w:styleId="Fuentedeprrafopredeter">
+  <w:style w:type="character" w:default="1" w:styleId="DefaultParagraphFont">
     <w:name w:val="Default Paragraph Font"/>
     <w:uiPriority w:val="1"/>
-    <w:semiHidden/>
     <w:unhideWhenUsed/>
   </w:style>
-  <w:style w:type="table" w:default="1" w:styleId="Tablanormal">
+  <w:style w:type="table" w:default="1" w:styleId="TableNormal">
     <w:name w:val="Normal Table"/>
     <w:uiPriority w:val="99"/>
     <w:semiHidden/>
@@ -8439,16 +9152,16 @@
       </w:tblCellMar>
     </w:tblPr>
   </w:style>
-  <w:style w:type="numbering" w:default="1" w:styleId="Sinlista">
+  <w:style w:type="numbering" w:default="1" w:styleId="NoList">
     <w:name w:val="No List"/>
     <w:uiPriority w:val="99"/>
     <w:semiHidden/>
     <w:unhideWhenUsed/>
   </w:style>
-  <w:style w:type="character" w:customStyle="1" w:styleId="Ttulo1Car">
-    <w:name w:val="Título 1 Car"/>
-    <w:basedOn w:val="Fuentedeprrafopredeter"/>
-    <w:link w:val="Ttulo1"/>
+  <w:style w:type="character" w:customStyle="1" w:styleId="Heading1Char">
+    <w:name w:val="Heading 1 Char"/>
+    <w:basedOn w:val="DefaultParagraphFont"/>
+    <w:link w:val="Heading1"/>
     <w:rsid w:val="004F02E8"/>
     <w:rPr>
       <w:rFonts w:ascii="Verdana" w:eastAsia="Times New Roman" w:hAnsi="Verdana" w:cs="Times New Roman"/>
@@ -8458,10 +9171,10 @@
       <w:lang w:val="en-US"/>
     </w:rPr>
   </w:style>
-  <w:style w:type="character" w:customStyle="1" w:styleId="Ttulo2Car">
-    <w:name w:val="Título 2 Car"/>
-    <w:basedOn w:val="Fuentedeprrafopredeter"/>
-    <w:link w:val="Ttulo2"/>
+  <w:style w:type="character" w:customStyle="1" w:styleId="Heading2Char">
+    <w:name w:val="Heading 2 Char"/>
+    <w:basedOn w:val="DefaultParagraphFont"/>
+    <w:link w:val="Heading2"/>
     <w:rsid w:val="001D76E1"/>
     <w:rPr>
       <w:rFonts w:ascii="Arial" w:eastAsia="Times New Roman" w:hAnsi="Arial" w:cs="Times New Roman"/>
@@ -8471,10 +9184,10 @@
       <w:lang w:val="en-US"/>
     </w:rPr>
   </w:style>
-  <w:style w:type="character" w:customStyle="1" w:styleId="Ttulo3Car">
-    <w:name w:val="Título 3 Car"/>
-    <w:basedOn w:val="Fuentedeprrafopredeter"/>
-    <w:link w:val="Ttulo3"/>
+  <w:style w:type="character" w:customStyle="1" w:styleId="Heading3Char">
+    <w:name w:val="Heading 3 Char"/>
+    <w:basedOn w:val="DefaultParagraphFont"/>
+    <w:link w:val="Heading3"/>
     <w:rsid w:val="001D76E1"/>
     <w:rPr>
       <w:rFonts w:ascii="Arial" w:eastAsia="Times New Roman" w:hAnsi="Arial" w:cs="Times New Roman"/>
@@ -8484,10 +9197,10 @@
       <w:lang w:val="en-US"/>
     </w:rPr>
   </w:style>
-  <w:style w:type="character" w:customStyle="1" w:styleId="Ttulo4Car">
-    <w:name w:val="Título 4 Car"/>
-    <w:basedOn w:val="Fuentedeprrafopredeter"/>
-    <w:link w:val="Ttulo4"/>
+  <w:style w:type="character" w:customStyle="1" w:styleId="Heading4Char">
+    <w:name w:val="Heading 4 Char"/>
+    <w:basedOn w:val="DefaultParagraphFont"/>
+    <w:link w:val="Heading4"/>
     <w:rsid w:val="001D76E1"/>
     <w:rPr>
       <w:rFonts w:ascii="Arial" w:eastAsia="Times New Roman" w:hAnsi="Arial" w:cs="Times New Roman"/>
@@ -8496,10 +9209,10 @@
       <w:lang w:val="en-US"/>
     </w:rPr>
   </w:style>
-  <w:style w:type="character" w:customStyle="1" w:styleId="Ttulo5Car">
-    <w:name w:val="Título 5 Car"/>
-    <w:basedOn w:val="Fuentedeprrafopredeter"/>
-    <w:link w:val="Ttulo5"/>
+  <w:style w:type="character" w:customStyle="1" w:styleId="Heading5Char">
+    <w:name w:val="Heading 5 Char"/>
+    <w:basedOn w:val="DefaultParagraphFont"/>
+    <w:link w:val="Heading5"/>
     <w:rsid w:val="001D76E1"/>
     <w:rPr>
       <w:rFonts w:ascii="Times New Roman" w:eastAsia="Times New Roman" w:hAnsi="Times New Roman" w:cs="Times New Roman"/>
@@ -8507,10 +9220,10 @@
       <w:lang w:val="en-US"/>
     </w:rPr>
   </w:style>
-  <w:style w:type="character" w:customStyle="1" w:styleId="Ttulo6Car">
-    <w:name w:val="Título 6 Car"/>
-    <w:basedOn w:val="Fuentedeprrafopredeter"/>
-    <w:link w:val="Ttulo6"/>
+  <w:style w:type="character" w:customStyle="1" w:styleId="Heading6Char">
+    <w:name w:val="Heading 6 Char"/>
+    <w:basedOn w:val="DefaultParagraphFont"/>
+    <w:link w:val="Heading6"/>
     <w:rsid w:val="001D76E1"/>
     <w:rPr>
       <w:rFonts w:ascii="Times New Roman" w:eastAsia="Times New Roman" w:hAnsi="Times New Roman" w:cs="Times New Roman"/>
@@ -8519,10 +9232,10 @@
       <w:lang w:val="en-US"/>
     </w:rPr>
   </w:style>
-  <w:style w:type="character" w:customStyle="1" w:styleId="Ttulo7Car">
-    <w:name w:val="Título 7 Car"/>
-    <w:basedOn w:val="Fuentedeprrafopredeter"/>
-    <w:link w:val="Ttulo7"/>
+  <w:style w:type="character" w:customStyle="1" w:styleId="Heading7Char">
+    <w:name w:val="Heading 7 Char"/>
+    <w:basedOn w:val="DefaultParagraphFont"/>
+    <w:link w:val="Heading7"/>
     <w:rsid w:val="001D76E1"/>
     <w:rPr>
       <w:rFonts w:ascii="Times New Roman" w:eastAsia="Times New Roman" w:hAnsi="Times New Roman" w:cs="Times New Roman"/>
@@ -8531,10 +9244,10 @@
       <w:lang w:val="en-US"/>
     </w:rPr>
   </w:style>
-  <w:style w:type="character" w:customStyle="1" w:styleId="Ttulo8Car">
-    <w:name w:val="Título 8 Car"/>
-    <w:basedOn w:val="Fuentedeprrafopredeter"/>
-    <w:link w:val="Ttulo8"/>
+  <w:style w:type="character" w:customStyle="1" w:styleId="Heading8Char">
+    <w:name w:val="Heading 8 Char"/>
+    <w:basedOn w:val="DefaultParagraphFont"/>
+    <w:link w:val="Heading8"/>
     <w:rsid w:val="001D76E1"/>
     <w:rPr>
       <w:rFonts w:ascii="Times New Roman" w:eastAsia="Times New Roman" w:hAnsi="Times New Roman" w:cs="Times New Roman"/>
@@ -8544,10 +9257,10 @@
       <w:lang w:val="en-US"/>
     </w:rPr>
   </w:style>
-  <w:style w:type="character" w:customStyle="1" w:styleId="Ttulo9Car">
-    <w:name w:val="Título 9 Car"/>
-    <w:basedOn w:val="Fuentedeprrafopredeter"/>
-    <w:link w:val="Ttulo9"/>
+  <w:style w:type="character" w:customStyle="1" w:styleId="Heading9Char">
+    <w:name w:val="Heading 9 Char"/>
+    <w:basedOn w:val="DefaultParagraphFont"/>
+    <w:link w:val="Heading9"/>
     <w:rsid w:val="001D76E1"/>
     <w:rPr>
       <w:rFonts w:ascii="Times New Roman" w:eastAsia="Times New Roman" w:hAnsi="Times New Roman" w:cs="Times New Roman"/>
@@ -8571,11 +9284,11 @@
       <w:lang w:val="en-AU"/>
     </w:rPr>
   </w:style>
-  <w:style w:type="paragraph" w:styleId="Ttulo">
+  <w:style w:type="paragraph" w:styleId="Title">
     <w:name w:val="Title"/>
     <w:basedOn w:val="Normal"/>
     <w:next w:val="Normal"/>
-    <w:link w:val="TtuloCar"/>
+    <w:link w:val="TitleChar"/>
     <w:qFormat/>
     <w:rsid w:val="004F7D35"/>
     <w:pPr>
@@ -8587,10 +9300,10 @@
       <w:sz w:val="36"/>
     </w:rPr>
   </w:style>
-  <w:style w:type="character" w:customStyle="1" w:styleId="TtuloCar">
-    <w:name w:val="Título Car"/>
-    <w:basedOn w:val="Fuentedeprrafopredeter"/>
-    <w:link w:val="Ttulo"/>
+  <w:style w:type="character" w:customStyle="1" w:styleId="TitleChar">
+    <w:name w:val="Title Char"/>
+    <w:basedOn w:val="DefaultParagraphFont"/>
+    <w:link w:val="Title"/>
     <w:rsid w:val="004F7D35"/>
     <w:rPr>
       <w:rFonts w:ascii="Verdana" w:eastAsia="Times New Roman" w:hAnsi="Verdana" w:cs="Times New Roman"/>
@@ -8600,7 +9313,7 @@
       <w:lang w:val="en-US"/>
     </w:rPr>
   </w:style>
-  <w:style w:type="paragraph" w:styleId="TDC1">
+  <w:style w:type="paragraph" w:styleId="TOC1">
     <w:name w:val="toc 1"/>
     <w:basedOn w:val="Normal"/>
     <w:next w:val="Normal"/>
@@ -8614,7 +9327,7 @@
       <w:ind w:right="720"/>
     </w:pPr>
   </w:style>
-  <w:style w:type="paragraph" w:styleId="TDC2">
+  <w:style w:type="paragraph" w:styleId="TOC2">
     <w:name w:val="toc 2"/>
     <w:basedOn w:val="Normal"/>
     <w:next w:val="Normal"/>
@@ -8627,7 +9340,7 @@
       <w:ind w:left="432" w:right="720"/>
     </w:pPr>
   </w:style>
-  <w:style w:type="paragraph" w:styleId="TDC3">
+  <w:style w:type="paragraph" w:styleId="TOC3">
     <w:name w:val="toc 3"/>
     <w:basedOn w:val="Normal"/>
     <w:next w:val="Normal"/>
@@ -8641,10 +9354,10 @@
       <w:ind w:left="864"/>
     </w:pPr>
   </w:style>
-  <w:style w:type="paragraph" w:styleId="Encabezado">
+  <w:style w:type="paragraph" w:styleId="Header">
     <w:name w:val="header"/>
     <w:basedOn w:val="Normal"/>
-    <w:link w:val="EncabezadoCar"/>
+    <w:link w:val="HeaderChar"/>
     <w:semiHidden/>
     <w:rsid w:val="001D76E1"/>
     <w:pPr>
@@ -8654,10 +9367,10 @@
       </w:tabs>
     </w:pPr>
   </w:style>
-  <w:style w:type="character" w:customStyle="1" w:styleId="EncabezadoCar">
-    <w:name w:val="Encabezado Car"/>
-    <w:basedOn w:val="Fuentedeprrafopredeter"/>
-    <w:link w:val="Encabezado"/>
+  <w:style w:type="character" w:customStyle="1" w:styleId="HeaderChar">
+    <w:name w:val="Header Char"/>
+    <w:basedOn w:val="DefaultParagraphFont"/>
+    <w:link w:val="Header"/>
     <w:semiHidden/>
     <w:rsid w:val="001D76E1"/>
     <w:rPr>
@@ -8667,10 +9380,10 @@
       <w:lang w:val="en-US"/>
     </w:rPr>
   </w:style>
-  <w:style w:type="paragraph" w:styleId="Piedepgina">
+  <w:style w:type="paragraph" w:styleId="Footer">
     <w:name w:val="footer"/>
     <w:basedOn w:val="Normal"/>
-    <w:link w:val="PiedepginaCar"/>
+    <w:link w:val="FooterChar"/>
     <w:semiHidden/>
     <w:rsid w:val="001D76E1"/>
     <w:pPr>
@@ -8680,10 +9393,10 @@
       </w:tabs>
     </w:pPr>
   </w:style>
-  <w:style w:type="character" w:customStyle="1" w:styleId="PiedepginaCar">
-    <w:name w:val="Pie de página Car"/>
-    <w:basedOn w:val="Fuentedeprrafopredeter"/>
-    <w:link w:val="Piedepgina"/>
+  <w:style w:type="character" w:customStyle="1" w:styleId="FooterChar">
+    <w:name w:val="Footer Char"/>
+    <w:basedOn w:val="DefaultParagraphFont"/>
+    <w:link w:val="Footer"/>
     <w:semiHidden/>
     <w:rsid w:val="001D76E1"/>
     <w:rPr>
@@ -8693,9 +9406,9 @@
       <w:lang w:val="en-US"/>
     </w:rPr>
   </w:style>
-  <w:style w:type="character" w:styleId="Nmerodepgina">
+  <w:style w:type="character" w:styleId="PageNumber">
     <w:name w:val="page number"/>
-    <w:basedOn w:val="Fuentedeprrafopredeter"/>
+    <w:basedOn w:val="DefaultParagraphFont"/>
     <w:semiHidden/>
     <w:rsid w:val="001D76E1"/>
   </w:style>
@@ -8708,10 +9421,10 @@
       <w:spacing w:after="120"/>
     </w:pPr>
   </w:style>
-  <w:style w:type="paragraph" w:styleId="Textoindependiente">
+  <w:style w:type="paragraph" w:styleId="BodyText">
     <w:name w:val="Body Text"/>
     <w:basedOn w:val="Normal"/>
-    <w:link w:val="TextoindependienteCar"/>
+    <w:link w:val="BodyTextChar"/>
     <w:semiHidden/>
     <w:rsid w:val="001D76E1"/>
     <w:pPr>
@@ -8720,10 +9433,10 @@
       <w:ind w:left="720"/>
     </w:pPr>
   </w:style>
-  <w:style w:type="character" w:customStyle="1" w:styleId="TextoindependienteCar">
-    <w:name w:val="Texto independiente Car"/>
-    <w:basedOn w:val="Fuentedeprrafopredeter"/>
-    <w:link w:val="Textoindependiente"/>
+  <w:style w:type="character" w:customStyle="1" w:styleId="BodyTextChar">
+    <w:name w:val="Body Text Char"/>
+    <w:basedOn w:val="DefaultParagraphFont"/>
+    <w:link w:val="BodyText"/>
     <w:semiHidden/>
     <w:rsid w:val="001D76E1"/>
     <w:rPr>
@@ -8736,7 +9449,7 @@
   <w:style w:type="paragraph" w:customStyle="1" w:styleId="InfoBlue">
     <w:name w:val="InfoBlue"/>
     <w:basedOn w:val="Normal"/>
-    <w:next w:val="Textoindependiente"/>
+    <w:next w:val="BodyText"/>
     <w:rsid w:val="001D76E1"/>
     <w:pPr>
       <w:spacing w:after="120"/>
@@ -8747,7 +9460,7 @@
       <w:color w:val="0000FF"/>
     </w:rPr>
   </w:style>
-  <w:style w:type="paragraph" w:styleId="Prrafodelista">
+  <w:style w:type="paragraph" w:styleId="ListParagraph">
     <w:name w:val="List Paragraph"/>
     <w:basedOn w:val="Normal"/>
     <w:uiPriority w:val="34"/>
@@ -8758,9 +9471,9 @@
       <w:contextualSpacing/>
     </w:pPr>
   </w:style>
-  <w:style w:type="table" w:styleId="Tablaconcuadrcula">
+  <w:style w:type="table" w:styleId="TableGrid">
     <w:name w:val="Table Grid"/>
-    <w:basedOn w:val="Tablanormal"/>
+    <w:basedOn w:val="TableNormal"/>
     <w:uiPriority w:val="59"/>
     <w:rsid w:val="0082400E"/>
     <w:pPr>
@@ -8777,9 +9490,9 @@
       </w:tblBorders>
     </w:tblPr>
   </w:style>
-  <w:style w:type="character" w:styleId="Textoennegrita">
+  <w:style w:type="character" w:styleId="Strong">
     <w:name w:val="Strong"/>
-    <w:basedOn w:val="Fuentedeprrafopredeter"/>
+    <w:basedOn w:val="DefaultParagraphFont"/>
     <w:uiPriority w:val="22"/>
     <w:qFormat/>
     <w:rsid w:val="0082400E"/>
@@ -8807,9 +9520,9 @@
       <w:lang w:val="es-ES" w:eastAsia="es-ES"/>
     </w:rPr>
   </w:style>
-  <w:style w:type="character" w:styleId="CdigoHTML">
+  <w:style w:type="character" w:styleId="HTMLCode">
     <w:name w:val="HTML Code"/>
-    <w:basedOn w:val="Fuentedeprrafopredeter"/>
+    <w:basedOn w:val="DefaultParagraphFont"/>
     <w:uiPriority w:val="99"/>
     <w:semiHidden/>
     <w:unhideWhenUsed/>
@@ -9107,6 +9820,15 @@
 </file>
 
 <file path=customXml/item1.xml><?xml version="1.0" encoding="utf-8"?>
+<?mso-contentType ?>
+<FormTemplates xmlns="http://schemas.microsoft.com/sharepoint/v3/contenttype/forms">
+  <Display>DocumentLibraryForm</Display>
+  <Edit>DocumentLibraryForm</Edit>
+  <New>DocumentLibraryForm</New>
+</FormTemplates>
+</file>
+
+<file path=customXml/item2.xml><?xml version="1.0" encoding="utf-8"?>
 <ct:contentTypeSchema xmlns:ct="http://schemas.microsoft.com/office/2006/metadata/contentType" xmlns:ma="http://schemas.microsoft.com/office/2006/metadata/properties/metaAttributes" ct:_="" ma:_="" ma:contentTypeName="Documento" ma:contentTypeID="0x010100A84EB69FEAAC124494464A843FB65F1B" ma:contentTypeVersion="15" ma:contentTypeDescription="Crear nuevo documento." ma:contentTypeScope="" ma:versionID="1640012617edff0de1b425616c9fe0b9">
   <xsd:schema xmlns:xsd="http://www.w3.org/2001/XMLSchema" xmlns:xs="http://www.w3.org/2001/XMLSchema" xmlns:p="http://schemas.microsoft.com/office/2006/metadata/properties" xmlns:ns2="e70db583-0384-45f2-bee4-d71087a4ae97" xmlns:ns3="d6169a53-58c7-4834-a922-92accc0d3c74" targetNamespace="http://schemas.microsoft.com/office/2006/metadata/properties" ma:root="true" ma:fieldsID="07db4f0170a8a23d5fd96252d775c9ce" ns2:_="" ns3:_="">
     <xsd:import namespace="e70db583-0384-45f2-bee4-d71087a4ae97"/>
@@ -9343,16 +10065,15 @@
 </ct:contentTypeSchema>
 </file>
 
-<file path=customXml/item2.xml><?xml version="1.0" encoding="utf-8"?>
-<?mso-contentType ?>
-<FormTemplates xmlns="http://schemas.microsoft.com/sharepoint/v3/contenttype/forms">
-  <Display>DocumentLibraryForm</Display>
-  <Edit>DocumentLibraryForm</Edit>
-  <New>DocumentLibraryForm</New>
-</FormTemplates>
+<file path=customXml/itemProps1.xml><?xml version="1.0" encoding="utf-8"?>
+<ds:datastoreItem xmlns:ds="http://schemas.openxmlformats.org/officeDocument/2006/customXml" ds:itemID="{28618440-9741-4A85-8383-ED2D768AAC91}">
+  <ds:schemaRefs>
+    <ds:schemaRef ds:uri="http://schemas.microsoft.com/sharepoint/v3/contenttype/forms"/>
+  </ds:schemaRefs>
+</ds:datastoreItem>
 </file>
 
-<file path=customXml/itemProps1.xml><?xml version="1.0" encoding="utf-8"?>
+<file path=customXml/itemProps2.xml><?xml version="1.0" encoding="utf-8"?>
 <ds:datastoreItem xmlns:ds="http://schemas.openxmlformats.org/officeDocument/2006/customXml" ds:itemID="{9948394E-78DD-4969-B9D1-4268901C028F}">
   <ds:schemaRefs>
     <ds:schemaRef ds:uri="http://schemas.microsoft.com/office/2006/metadata/contentType"/>
@@ -9369,12 +10090,4 @@
     <ds:schemaRef ds:uri="http://schemas.microsoft.com/internal/obd"/>
   </ds:schemaRefs>
 </ds:datastoreItem>
-</file>
-
-<file path=customXml/itemProps2.xml><?xml version="1.0" encoding="utf-8"?>
-<ds:datastoreItem xmlns:ds="http://schemas.openxmlformats.org/officeDocument/2006/customXml" ds:itemID="{28618440-9741-4A85-8383-ED2D768AAC91}">
-  <ds:schemaRefs>
-    <ds:schemaRef ds:uri="http://schemas.microsoft.com/sharepoint/v3/contenttype/forms"/>
-  </ds:schemaRefs>
-</ds:datastoreItem>
 </file>
</xml_diff>